<commit_message>
1.4.0 - Se cobra lo que dice el anaquel; ventas una por una
- El total en Bs es precio al publico x cantidad, no total_usd x tasa: el
  cafe de 1,6614 USD exhibido a 1.400 Bs se cobraba 1.398,06. RN-22 y RN-23
  cambian (en el .docx y el .md): cada pago cubre la venta en su moneda y el
  vuelto se lleva en Bs.
- Reporte «Ventas una por una»: tambien las de mostrador, filtros por
  numero, cliente y producto, doble clic con la nota y reimpresion.
- Libro de ventas: columna «Cobrado Bs» al lado del total a la tasa, hasta
  que el contador elija.
- Enter en el cobro confirmaba la venta con la ventana a la vista (desde la
  Fase 3): confirmar es F12 y solo F12.
- Capturas del manual regeneradas.

Co-Authored-By: Claude Opus 5 (1M context) <noreply@anthropic.com>
Claude-Session: https://claude.ai/code/session_016r1zE7s3j4hNCoaib8HGaS
</commit_message>
<xml_diff>
--- a/docs/Borealis - Reglas de Negocio - Minimarket.docx
+++ b/docs/Borealis - Reglas de Negocio - Minimarket.docx
@@ -3622,7 +3622,7 @@
           <w:sz w:val="20"/>
           <w:szCs w:val="20"/>
         </w:rPr>
-        <w:t xml:space="preserve">RN-22 · Cobro con varios medios</w:t>
+        <w:t xml:space="preserve">RN-22 · Cobro con varios medios (modificada en 1.4.0)</w:t>
       </w:r>
     </w:p>
     <w:p>
@@ -3646,37 +3646,7 @@
           <w:sz w:val="20"/>
           <w:szCs w:val="20"/>
         </w:rPr>
-        <w:t xml:space="preserve">Σ  monto_usd  de  los  pagos   ≥   total_venta_usd</w:t>
-      </w:r>
-    </w:p>
-    <w:p>
-      <w:pPr>
-        <w:spacing w:after="90" w:before="90" w:line="288"/>
-        <w:jc w:val="both"/>
-      </w:pPr>
-      <w:r>
-        <w:rPr>
-          <w:color w:val="222222"/>
-          <w:sz w:val="20"/>
-          <w:szCs w:val="20"/>
-        </w:rPr>
-        <w:t xml:space="preserve">Cada pago se registra en su moneda original junto con su equivalente en dólares, calculado a la tasa de la venta. La venta no se confirma mientras la suma de los pagos no alcance el total.</w:t>
-      </w:r>
-    </w:p>
-    <w:p>
-      <w:pPr>
-        <w:pStyle w:val="Heading3"/>
-        <w:spacing w:after="60" w:before="200"/>
-      </w:pPr>
-      <w:r>
-        <w:rPr>
-          <w:b/>
-          <w:bCs/>
-          <w:color w:val="333333"/>
-          <w:sz w:val="20"/>
-          <w:szCs w:val="20"/>
-        </w:rPr>
-        <w:t xml:space="preserve">RN-23 · Vuelto</w:t>
+        <w:t xml:space="preserve">total_venta_bs  =  Σ  redondear( cantidad × precio_al_público_bs , 2 )</w:t>
       </w:r>
     </w:p>
     <w:p>
@@ -3700,7 +3670,75 @@
           <w:sz w:val="20"/>
           <w:szCs w:val="20"/>
         </w:rPr>
-        <w:t xml:space="preserve">vuelto_usd  =  Σ monto_usd  de  los  pagos  −  total_venta_usd</w:t>
+        <w:t xml:space="preserve">Σ pagos_bs / total_venta_bs  +  Σ pagos_usd / total_venta_usd   ≥   1</w:t>
+      </w:r>
+    </w:p>
+    <w:p>
+      <w:pPr>
+        <w:spacing w:after="90" w:before="90" w:line="288"/>
+        <w:jc w:val="both"/>
+      </w:pPr>
+      <w:r>
+        <w:rPr>
+          <w:color w:val="222222"/>
+          <w:sz w:val="20"/>
+          <w:szCs w:val="20"/>
+        </w:rPr>
+        <w:t xml:space="preserve">El precio al público en bolívares es el de RN-03 con el redondeo de RN-10, el mismo que se exhibe. Cada pago cubre la venta en su propia moneda: los bolívares contra el total en bolívares y los dólares contra el total en dólares. Primero cuentan los bolívares y lo que falta se cubre en proporción con dólares. Cada pago se registra en su moneda original junto con su equivalente en dólares, calculado a la tasa de la venta. La venta no se confirma mientras los pagos no alcancen el total.</w:t>
+      </w:r>
+    </w:p>
+    <w:p>
+      <w:pPr>
+        <w:spacing w:after="90" w:before="90" w:line="288"/>
+        <w:jc w:val="both"/>
+      </w:pPr>
+      <w:r>
+        <w:rPr>
+          <w:color w:val="222222"/>
+          <w:sz w:val="20"/>
+          <w:szCs w:val="20"/>
+        </w:rPr>
+        <w:t xml:space="preserve">Por qué cambió: con la tasa en 842, un centavo de dólar vale 8,42 Bs. Convertir el total ya redondeado a centavos (1,66 USD × 842,2067 = 1.398,06 Bs) no coincidía con el precio exhibido (1,6614 × 842,2067 = 1.399,24 → 1.400 Bs), y podía cobrar de más o de menos.</w:t>
+      </w:r>
+    </w:p>
+    <w:p>
+      <w:pPr>
+        <w:pStyle w:val="Heading3"/>
+        <w:spacing w:after="60" w:before="200"/>
+      </w:pPr>
+      <w:r>
+        <w:rPr>
+          <w:b/>
+          <w:bCs/>
+          <w:color w:val="333333"/>
+          <w:sz w:val="20"/>
+          <w:szCs w:val="20"/>
+        </w:rPr>
+        <w:t xml:space="preserve">RN-23 · Vuelto (modificada en 1.4.0)</w:t>
+      </w:r>
+    </w:p>
+    <w:p>
+      <w:pPr>
+        <w:pBdr>
+          <w:top w:val="single" w:color="C9DBE1" w:sz="2"/>
+          <w:bottom w:val="single" w:color="C9DBE1" w:sz="2"/>
+          <w:left w:val="single" w:color="C9DBE1" w:sz="2"/>
+          <w:right w:val="single" w:color="C9DBE1" w:sz="2"/>
+        </w:pBdr>
+        <w:shd w:fill="EDF3F5" w:color="auto" w:val="clear"/>
+        <w:spacing w:after="110" w:before="110"/>
+        <w:jc w:val="center"/>
+      </w:pPr>
+      <w:r>
+        <w:rPr>
+          <w:rFonts w:ascii="Consolas" w:cs="Consolas" w:eastAsia="Consolas" w:hAnsi="Consolas"/>
+          <w:b/>
+          <w:bCs/>
+          <w:color w:val="10333F"/>
+          <w:sz w:val="20"/>
+          <w:szCs w:val="20"/>
+        </w:rPr>
+        <w:t xml:space="preserve">vuelto_bs  =  lo pagado que excede el total según RN-22; lo que sobra de los dólares, a la tasa de la venta</w:t>
       </w:r>
     </w:p>
     <w:p>
@@ -4513,7 +4551,7 @@
                 <w:sz w:val="18"/>
                 <w:szCs w:val="18"/>
               </w:rPr>
-              <w:t xml:space="preserve">Equivalente en bolívares</w:t>
+              <w:t xml:space="preserve">Total en bolívares (1.4.0)</w:t>
             </w:r>
           </w:p>
         </w:tc>
@@ -4536,7 +4574,7 @@
                 <w:sz w:val="18"/>
                 <w:szCs w:val="18"/>
               </w:rPr>
-              <w:t xml:space="preserve">4,76 × 210,500000</w:t>
+              <w:t xml:space="preserve">4 × 165,00 + 2 × 174,00</w:t>
             </w:r>
           </w:p>
         </w:tc>
@@ -4559,7 +4597,7 @@
                 <w:sz w:val="18"/>
                 <w:szCs w:val="18"/>
               </w:rPr>
-              <w:t xml:space="preserve">1.001,98 Bs</w:t>
+              <w:t xml:space="preserve">1.008,00 Bs</w:t>
             </w:r>
           </w:p>
         </w:tc>

</xml_diff>